<commit_message>
Descripción de los cambios que hiciste
</commit_message>
<xml_diff>
--- a/Microservicios_RomanUrrego_CristianOtalvaro.docx
+++ b/Microservicios_RomanUrrego_CristianOtalvaro.docx
@@ -285,7 +285,6 @@
         <w:t xml:space="preserve">Cada microservicio cuenta con su propio </w:t>
       </w:r>
       <w:proofErr w:type="spellStart"/>
-      <w:proofErr w:type="gramStart"/>
       <w:r>
         <w:rPr>
           <w:b/>
@@ -294,7 +293,6 @@
         <w:t>application.properties</w:t>
       </w:r>
       <w:proofErr w:type="spellEnd"/>
-      <w:proofErr w:type="gramEnd"/>
       <w:r>
         <w:t xml:space="preserve">, archivo </w:t>
       </w:r>
@@ -545,57 +543,7 @@
                               <w:rPr>
                                 <w:lang w:val="en-US"/>
                               </w:rPr>
-                              <w:t xml:space="preserve">  </w:t>
-                            </w:r>
-                            <w:proofErr w:type="gramStart"/>
-                            <w:r>
-                              <w:rPr>
-                                <w:lang w:val="en-US"/>
-                              </w:rPr>
-                              <w:t>&lt;</w:t>
-                            </w:r>
-                            <w:proofErr w:type="spellStart"/>
-                            <w:r>
-                              <w:rPr>
-                                <w:lang w:val="en-US"/>
-                              </w:rPr>
-                              <w:t>groupId</w:t>
-                            </w:r>
-                            <w:proofErr w:type="spellEnd"/>
-                            <w:r>
-                              <w:rPr>
-                                <w:lang w:val="en-US"/>
-                              </w:rPr>
-                              <w:t>&gt;</w:t>
-                            </w:r>
-                            <w:proofErr w:type="spellStart"/>
-                            <w:r>
-                              <w:rPr>
-                                <w:lang w:val="en-US"/>
-                              </w:rPr>
-                              <w:t>org.springframework.cloud</w:t>
-                            </w:r>
-                            <w:proofErr w:type="spellEnd"/>
-                            <w:proofErr w:type="gramEnd"/>
-                            <w:r>
-                              <w:rPr>
-                                <w:lang w:val="en-US"/>
-                              </w:rPr>
-                              <w:t>&lt;/</w:t>
-                            </w:r>
-                            <w:proofErr w:type="spellStart"/>
-                            <w:r>
-                              <w:rPr>
-                                <w:lang w:val="en-US"/>
-                              </w:rPr>
-                              <w:t>groupId</w:t>
-                            </w:r>
-                            <w:proofErr w:type="spellEnd"/>
-                            <w:r>
-                              <w:rPr>
-                                <w:lang w:val="en-US"/>
-                              </w:rPr>
-                              <w:t>&gt;</w:t>
+                              <w:t xml:space="preserve">  &lt;groupId&gt;org.springframework.cloud&lt;/groupId&gt;</w:t>
                             </w:r>
                           </w:p>
                           <w:p>
@@ -618,15 +566,7 @@
                               </w:rPr>
                             </w:pPr>
                             <w:r>
-                              <w:t>&lt;/</w:t>
-                            </w:r>
-                            <w:proofErr w:type="spellStart"/>
-                            <w:r>
-                              <w:t>dependency</w:t>
-                            </w:r>
-                            <w:proofErr w:type="spellEnd"/>
-                            <w:r>
-                              <w:t>&gt;</w:t>
+                              <w:t>&lt;/dependency&gt;</w:t>
                             </w:r>
                           </w:p>
                         </w:txbxContent>
@@ -800,23 +740,7 @@
           <w:b/>
           <w:bCs/>
         </w:rPr>
-        <w:t xml:space="preserve"> con el </w:t>
-      </w:r>
-      <w:proofErr w:type="gramStart"/>
-      <w:r>
-        <w:rPr>
-          <w:b/>
-          <w:bCs/>
-        </w:rPr>
-        <w:t>server</w:t>
-      </w:r>
-      <w:proofErr w:type="gramEnd"/>
-      <w:r>
-        <w:rPr>
-          <w:b/>
-          <w:bCs/>
-        </w:rPr>
-        <w:t xml:space="preserve"> </w:t>
+        <w:t xml:space="preserve"> con el server </w:t>
       </w:r>
       <w:r>
         <w:rPr>
@@ -1881,41 +1805,11 @@
                               </w:rPr>
                               <w:t xml:space="preserve">public </w:t>
                             </w:r>
-                            <w:proofErr w:type="spellStart"/>
                             <w:r>
                               <w:rPr>
                                 <w:lang w:val="en-US"/>
                               </w:rPr>
-                              <w:t>Asignatura</w:t>
-                            </w:r>
-                            <w:proofErr w:type="spellEnd"/>
-                            <w:r>
-                              <w:rPr>
-                                <w:lang w:val="en-US"/>
-                              </w:rPr>
-                              <w:t xml:space="preserve"> </w:t>
-                            </w:r>
-                            <w:proofErr w:type="spellStart"/>
-                            <w:proofErr w:type="gramStart"/>
-                            <w:r>
-                              <w:rPr>
-                                <w:lang w:val="en-US"/>
-                              </w:rPr>
-                              <w:t>obtenerAsignatura</w:t>
-                            </w:r>
-                            <w:proofErr w:type="spellEnd"/>
-                            <w:r>
-                              <w:rPr>
-                                <w:lang w:val="en-US"/>
-                              </w:rPr>
-                              <w:t>(</w:t>
-                            </w:r>
-                            <w:proofErr w:type="gramEnd"/>
-                            <w:r>
-                              <w:rPr>
-                                <w:lang w:val="en-US"/>
-                              </w:rPr>
-                              <w:t>@PathVariable Long id) {</w:t>
+                              <w:t>Asignatura obtenerAsignatura(@PathVariable Long id) {</w:t>
                             </w:r>
                           </w:p>
                           <w:p>
@@ -1925,21 +1819,8 @@
                               </w:rPr>
                               <w:t xml:space="preserve">    </w:t>
                             </w:r>
-                            <w:proofErr w:type="spellStart"/>
                             <w:r>
-                              <w:t>return</w:t>
-                            </w:r>
-                            <w:proofErr w:type="spellEnd"/>
-                            <w:r>
-                              <w:t xml:space="preserve"> new </w:t>
-                            </w:r>
-                            <w:proofErr w:type="gramStart"/>
-                            <w:r>
-                              <w:t>Asignatura(</w:t>
-                            </w:r>
-                            <w:proofErr w:type="gramEnd"/>
-                            <w:r>
-                              <w:t>id, "Matemáticas", "Asignatura de cálculo");</w:t>
+                              <w:t>return new Asignatura(id, "Matemáticas", "Asignatura de cálculo");</w:t>
                             </w:r>
                           </w:p>
                           <w:p>
@@ -1997,7 +1878,13 @@
                         <w:rPr>
                           <w:lang w:val="en-US"/>
                         </w:rPr>
-                        <w:t>public Asignatura obtenerAsignatura(@PathVariable Long id) {</w:t>
+                        <w:t xml:space="preserve">public </w:t>
+                      </w:r>
+                      <w:r>
+                        <w:rPr>
+                          <w:lang w:val="en-US"/>
+                        </w:rPr>
+                        <w:t>Asignatura obtenerAsignatura(@PathVariable Long id) {</w:t>
                       </w:r>
                     </w:p>
                     <w:p>
@@ -2636,41 +2523,13 @@
                               </w:rPr>
                               <w:t xml:space="preserve">public class </w:t>
                             </w:r>
-                            <w:proofErr w:type="spellStart"/>
                             <w:r>
                               <w:rPr>
                                 <w:sz w:val="18"/>
                                 <w:szCs w:val="18"/>
                                 <w:lang w:val="en-US"/>
                               </w:rPr>
-                              <w:t>FeignClientInterceptor</w:t>
-                            </w:r>
-                            <w:proofErr w:type="spellEnd"/>
-                            <w:r>
-                              <w:rPr>
-                                <w:sz w:val="18"/>
-                                <w:szCs w:val="18"/>
-                                <w:lang w:val="en-US"/>
-                              </w:rPr>
-                              <w:t xml:space="preserve"> implements </w:t>
-                            </w:r>
-                            <w:proofErr w:type="spellStart"/>
-                            <w:r>
-                              <w:rPr>
-                                <w:sz w:val="18"/>
-                                <w:szCs w:val="18"/>
-                                <w:lang w:val="en-US"/>
-                              </w:rPr>
-                              <w:t>RequestInterceptor</w:t>
-                            </w:r>
-                            <w:proofErr w:type="spellEnd"/>
-                            <w:r>
-                              <w:rPr>
-                                <w:sz w:val="18"/>
-                                <w:szCs w:val="18"/>
-                                <w:lang w:val="en-US"/>
-                              </w:rPr>
-                              <w:t xml:space="preserve"> {</w:t>
+                              <w:t>FeignClientInterceptor implements RequestInterceptor {</w:t>
                             </w:r>
                           </w:p>
                           <w:p>
@@ -2687,46 +2546,8 @@
                                 <w:szCs w:val="18"/>
                                 <w:lang w:val="en-US"/>
                               </w:rPr>
-                              <w:t xml:space="preserve">    private final </w:t>
+                              <w:t xml:space="preserve">    private final TokenProvider tokenProvider;</w:t>
                             </w:r>
-                            <w:proofErr w:type="spellStart"/>
-                            <w:r>
-                              <w:rPr>
-                                <w:sz w:val="18"/>
-                                <w:szCs w:val="18"/>
-                                <w:lang w:val="en-US"/>
-                              </w:rPr>
-                              <w:t>TokenProvider</w:t>
-                            </w:r>
-                            <w:proofErr w:type="spellEnd"/>
-                            <w:r>
-                              <w:rPr>
-                                <w:sz w:val="18"/>
-                                <w:szCs w:val="18"/>
-                                <w:lang w:val="en-US"/>
-                              </w:rPr>
-                              <w:t xml:space="preserve"> </w:t>
-                            </w:r>
-                            <w:proofErr w:type="spellStart"/>
-                            <w:proofErr w:type="gramStart"/>
-                            <w:r>
-                              <w:rPr>
-                                <w:sz w:val="18"/>
-                                <w:szCs w:val="18"/>
-                                <w:lang w:val="en-US"/>
-                              </w:rPr>
-                              <w:t>tokenProvider</w:t>
-                            </w:r>
-                            <w:proofErr w:type="spellEnd"/>
-                            <w:r>
-                              <w:rPr>
-                                <w:sz w:val="18"/>
-                                <w:szCs w:val="18"/>
-                                <w:lang w:val="en-US"/>
-                              </w:rPr>
-                              <w:t>;</w:t>
-                            </w:r>
-                            <w:proofErr w:type="gramEnd"/>
                           </w:p>
                           <w:p>
                             <w:pPr>
@@ -2751,63 +2572,7 @@
                                 <w:szCs w:val="18"/>
                                 <w:lang w:val="en-US"/>
                               </w:rPr>
-                              <w:t xml:space="preserve">    public </w:t>
-                            </w:r>
-                            <w:proofErr w:type="spellStart"/>
-                            <w:proofErr w:type="gramStart"/>
-                            <w:r>
-                              <w:rPr>
-                                <w:sz w:val="18"/>
-                                <w:szCs w:val="18"/>
-                                <w:lang w:val="en-US"/>
-                              </w:rPr>
-                              <w:t>FeignClientInterceptor</w:t>
-                            </w:r>
-                            <w:proofErr w:type="spellEnd"/>
-                            <w:r>
-                              <w:rPr>
-                                <w:sz w:val="18"/>
-                                <w:szCs w:val="18"/>
-                                <w:lang w:val="en-US"/>
-                              </w:rPr>
-                              <w:t>(</w:t>
-                            </w:r>
-                            <w:proofErr w:type="spellStart"/>
-                            <w:proofErr w:type="gramEnd"/>
-                            <w:r>
-                              <w:rPr>
-                                <w:sz w:val="18"/>
-                                <w:szCs w:val="18"/>
-                                <w:lang w:val="en-US"/>
-                              </w:rPr>
-                              <w:t>TokenProvider</w:t>
-                            </w:r>
-                            <w:proofErr w:type="spellEnd"/>
-                            <w:r>
-                              <w:rPr>
-                                <w:sz w:val="18"/>
-                                <w:szCs w:val="18"/>
-                                <w:lang w:val="en-US"/>
-                              </w:rPr>
-                              <w:t xml:space="preserve"> </w:t>
-                            </w:r>
-                            <w:proofErr w:type="spellStart"/>
-                            <w:r>
-                              <w:rPr>
-                                <w:sz w:val="18"/>
-                                <w:szCs w:val="18"/>
-                                <w:lang w:val="en-US"/>
-                              </w:rPr>
-                              <w:t>tokenProvider</w:t>
-                            </w:r>
-                            <w:proofErr w:type="spellEnd"/>
-                            <w:r>
-                              <w:rPr>
-                                <w:sz w:val="18"/>
-                                <w:szCs w:val="18"/>
-                                <w:lang w:val="en-US"/>
-                              </w:rPr>
-                              <w:t>) {</w:t>
+                              <w:t xml:space="preserve">    public FeignClientInterceptor(TokenProvider tokenProvider) {</w:t>
                             </w:r>
                           </w:p>
                           <w:p>
@@ -2824,48 +2589,8 @@
                                 <w:szCs w:val="18"/>
                                 <w:lang w:val="en-US"/>
                               </w:rPr>
-                              <w:t xml:space="preserve">        </w:t>
+                              <w:t xml:space="preserve">        this.tokenProvider = tokenProvider;</w:t>
                             </w:r>
-                            <w:proofErr w:type="spellStart"/>
-                            <w:proofErr w:type="gramStart"/>
-                            <w:r>
-                              <w:rPr>
-                                <w:sz w:val="18"/>
-                                <w:szCs w:val="18"/>
-                                <w:lang w:val="en-US"/>
-                              </w:rPr>
-                              <w:t>this.tokenProvider</w:t>
-                            </w:r>
-                            <w:proofErr w:type="spellEnd"/>
-                            <w:proofErr w:type="gramEnd"/>
-                            <w:r>
-                              <w:rPr>
-                                <w:sz w:val="18"/>
-                                <w:szCs w:val="18"/>
-                                <w:lang w:val="en-US"/>
-                              </w:rPr>
-                              <w:t xml:space="preserve"> = </w:t>
-                            </w:r>
-                            <w:proofErr w:type="spellStart"/>
-                            <w:proofErr w:type="gramStart"/>
-                            <w:r>
-                              <w:rPr>
-                                <w:sz w:val="18"/>
-                                <w:szCs w:val="18"/>
-                                <w:lang w:val="en-US"/>
-                              </w:rPr>
-                              <w:t>tokenProvider</w:t>
-                            </w:r>
-                            <w:proofErr w:type="spellEnd"/>
-                            <w:r>
-                              <w:rPr>
-                                <w:sz w:val="18"/>
-                                <w:szCs w:val="18"/>
-                                <w:lang w:val="en-US"/>
-                              </w:rPr>
-                              <w:t>;</w:t>
-                            </w:r>
-                            <w:proofErr w:type="gramEnd"/>
                           </w:p>
                           <w:p>
                             <w:pPr>
@@ -2924,35 +2649,7 @@
                                 <w:szCs w:val="18"/>
                                 <w:lang w:val="en-US"/>
                               </w:rPr>
-                              <w:t xml:space="preserve">    public void </w:t>
-                            </w:r>
-                            <w:proofErr w:type="gramStart"/>
-                            <w:r>
-                              <w:rPr>
-                                <w:sz w:val="18"/>
-                                <w:szCs w:val="18"/>
-                                <w:lang w:val="en-US"/>
-                              </w:rPr>
-                              <w:t>apply(</w:t>
-                            </w:r>
-                            <w:proofErr w:type="spellStart"/>
-                            <w:proofErr w:type="gramEnd"/>
-                            <w:r>
-                              <w:rPr>
-                                <w:sz w:val="18"/>
-                                <w:szCs w:val="18"/>
-                                <w:lang w:val="en-US"/>
-                              </w:rPr>
-                              <w:t>RequestTemplate</w:t>
-                            </w:r>
-                            <w:proofErr w:type="spellEnd"/>
-                            <w:r>
-                              <w:rPr>
-                                <w:sz w:val="18"/>
-                                <w:szCs w:val="18"/>
-                                <w:lang w:val="en-US"/>
-                              </w:rPr>
-                              <w:t xml:space="preserve"> template) {</w:t>
+                              <w:t xml:space="preserve">    public void apply(RequestTemplate template) {</w:t>
                             </w:r>
                           </w:p>
                           <w:p>
@@ -2969,70 +2666,7 @@
                                 <w:szCs w:val="18"/>
                                 <w:lang w:val="en-US"/>
                               </w:rPr>
-                              <w:t xml:space="preserve">        String token = </w:t>
-                            </w:r>
-                            <w:proofErr w:type="spellStart"/>
-                            <w:r>
-                              <w:rPr>
-                                <w:sz w:val="18"/>
-                                <w:szCs w:val="18"/>
-                                <w:lang w:val="en-US"/>
-                              </w:rPr>
-                              <w:t>tokenProvider.getToken</w:t>
-                            </w:r>
-                            <w:proofErr w:type="spellEnd"/>
-                            <w:r>
-                              <w:rPr>
-                                <w:sz w:val="18"/>
-                                <w:szCs w:val="18"/>
-                                <w:lang w:val="en-US"/>
-                              </w:rPr>
-                              <w:t>(</w:t>
-                            </w:r>
-                            <w:proofErr w:type="gramStart"/>
-                            <w:r>
-                              <w:rPr>
-                                <w:sz w:val="18"/>
-                                <w:szCs w:val="18"/>
-                                <w:lang w:val="en-US"/>
-                              </w:rPr>
-                              <w:t>);</w:t>
-                            </w:r>
-                            <w:proofErr w:type="gramEnd"/>
-                          </w:p>
-                          <w:p>
-                            <w:pPr>
-                              <w:rPr>
-                                <w:sz w:val="18"/>
-                                <w:szCs w:val="18"/>
-                                <w:lang w:val="en-US"/>
-                              </w:rPr>
-                            </w:pPr>
-                            <w:r>
-                              <w:rPr>
-                                <w:sz w:val="18"/>
-                                <w:szCs w:val="18"/>
-                                <w:lang w:val="en-US"/>
-                              </w:rPr>
-                              <w:t xml:space="preserve">        if (</w:t>
-                            </w:r>
-                            <w:proofErr w:type="gramStart"/>
-                            <w:r>
-                              <w:rPr>
-                                <w:sz w:val="18"/>
-                                <w:szCs w:val="18"/>
-                                <w:lang w:val="en-US"/>
-                              </w:rPr>
-                              <w:t>token !</w:t>
-                            </w:r>
-                            <w:proofErr w:type="gramEnd"/>
-                            <w:r>
-                              <w:rPr>
-                                <w:sz w:val="18"/>
-                                <w:szCs w:val="18"/>
-                                <w:lang w:val="en-US"/>
-                              </w:rPr>
-                              <w:t>= null) {</w:t>
+                              <w:t xml:space="preserve">        String token = tokenProvider.getToken();</w:t>
                             </w:r>
                           </w:p>
                           <w:p>
@@ -3049,38 +2683,25 @@
                                 <w:szCs w:val="18"/>
                                 <w:lang w:val="en-US"/>
                               </w:rPr>
-                              <w:t xml:space="preserve">            </w:t>
+                              <w:t xml:space="preserve">        if (token != null) {</w:t>
                             </w:r>
-                            <w:proofErr w:type="spellStart"/>
-                            <w:proofErr w:type="gramStart"/>
+                          </w:p>
+                          <w:p>
+                            <w:pPr>
+                              <w:rPr>
+                                <w:sz w:val="18"/>
+                                <w:szCs w:val="18"/>
+                                <w:lang w:val="en-US"/>
+                              </w:rPr>
+                            </w:pPr>
                             <w:r>
                               <w:rPr>
                                 <w:sz w:val="18"/>
                                 <w:szCs w:val="18"/>
                                 <w:lang w:val="en-US"/>
                               </w:rPr>
-                              <w:t>template.header</w:t>
+                              <w:t xml:space="preserve">            template.header("Authorization", "Bearer " + token);</w:t>
                             </w:r>
-                            <w:proofErr w:type="spellEnd"/>
-                            <w:proofErr w:type="gramEnd"/>
-                            <w:r>
-                              <w:rPr>
-                                <w:sz w:val="18"/>
-                                <w:szCs w:val="18"/>
-                                <w:lang w:val="en-US"/>
-                              </w:rPr>
-                              <w:t>("Authorization", "Bearer " + token</w:t>
-                            </w:r>
-                            <w:proofErr w:type="gramStart"/>
-                            <w:r>
-                              <w:rPr>
-                                <w:sz w:val="18"/>
-                                <w:szCs w:val="18"/>
-                                <w:lang w:val="en-US"/>
-                              </w:rPr>
-                              <w:t>);</w:t>
-                            </w:r>
-                            <w:proofErr w:type="gramEnd"/>
                           </w:p>
                           <w:p>
                             <w:pPr>
@@ -3183,7 +2804,15 @@
                           <w:szCs w:val="18"/>
                           <w:lang w:val="en-US"/>
                         </w:rPr>
-                        <w:t>public class FeignClientInterceptor implements RequestInterceptor {</w:t>
+                        <w:t xml:space="preserve">public class </w:t>
+                      </w:r>
+                      <w:r>
+                        <w:rPr>
+                          <w:sz w:val="18"/>
+                          <w:szCs w:val="18"/>
+                          <w:lang w:val="en-US"/>
+                        </w:rPr>
+                        <w:t>FeignClientInterceptor implements RequestInterceptor {</w:t>
                       </w:r>
                     </w:p>
                     <w:p>
@@ -4587,7 +4216,6 @@
         <w:t xml:space="preserve"> y para </w:t>
       </w:r>
       <w:proofErr w:type="spellStart"/>
-      <w:proofErr w:type="gramStart"/>
       <w:r>
         <w:rPr>
           <w:sz w:val="24"/>
@@ -4601,15 +4229,7 @@
           <w:sz w:val="24"/>
           <w:szCs w:val="24"/>
         </w:rPr>
-        <w:t>,,</w:t>
-      </w:r>
-      <w:proofErr w:type="gramEnd"/>
-      <w:r>
-        <w:rPr>
-          <w:sz w:val="24"/>
-          <w:szCs w:val="24"/>
-        </w:rPr>
-        <w:t xml:space="preserve"> con resultados exitosos.</w:t>
+        <w:t>,, con resultados exitosos.</w:t>
       </w:r>
     </w:p>
     <w:p>
@@ -4973,7 +4593,23 @@
           <w:sz w:val="24"/>
           <w:szCs w:val="24"/>
         </w:rPr>
-        <w:t xml:space="preserve">se ejecuto una prueba </w:t>
+        <w:t xml:space="preserve">se </w:t>
+      </w:r>
+      <w:proofErr w:type="spellStart"/>
+      <w:r>
+        <w:rPr>
+          <w:sz w:val="24"/>
+          <w:szCs w:val="24"/>
+        </w:rPr>
+        <w:t>ejecuto</w:t>
+      </w:r>
+      <w:proofErr w:type="spellEnd"/>
+      <w:r>
+        <w:rPr>
+          <w:sz w:val="24"/>
+          <w:szCs w:val="24"/>
+        </w:rPr>
+        <w:t xml:space="preserve"> una prueba </w:t>
       </w:r>
       <w:proofErr w:type="spellStart"/>
       <w:r>
@@ -5166,17 +4802,8 @@
           <w:sz w:val="24"/>
           <w:szCs w:val="24"/>
         </w:rPr>
-        <w:t>-api-matriculas-</w:t>
-      </w:r>
-      <w:proofErr w:type="gramStart"/>
-      <w:r>
-        <w:rPr>
-          <w:sz w:val="24"/>
-          <w:szCs w:val="24"/>
-        </w:rPr>
-        <w:t>servicios .</w:t>
-      </w:r>
-      <w:proofErr w:type="gramEnd"/>
+        <w:t>-api-matriculas-servicios .</w:t>
+      </w:r>
     </w:p>
     <w:p>
       <w:pPr>
@@ -5276,23 +4903,7 @@
           <w:sz w:val="24"/>
           <w:szCs w:val="24"/>
         </w:rPr>
-        <w:t xml:space="preserve"> o con </w:t>
-      </w:r>
-      <w:proofErr w:type="gramStart"/>
-      <w:r>
-        <w:rPr>
-          <w:sz w:val="24"/>
-          <w:szCs w:val="24"/>
-        </w:rPr>
-        <w:t>el  Docker</w:t>
-      </w:r>
-      <w:proofErr w:type="gramEnd"/>
-      <w:r>
-        <w:rPr>
-          <w:sz w:val="24"/>
-          <w:szCs w:val="24"/>
-        </w:rPr>
-        <w:t xml:space="preserve"> desktop</w:t>
+        <w:t xml:space="preserve"> o con el  Docker desktop</w:t>
       </w:r>
     </w:p>
     <w:p>
@@ -6111,7 +5722,6 @@
         <w:t xml:space="preserve">En </w:t>
       </w:r>
       <w:proofErr w:type="spellStart"/>
-      <w:proofErr w:type="gramStart"/>
       <w:r>
         <w:rPr>
           <w:sz w:val="24"/>
@@ -6120,7 +5730,6 @@
         <w:t>application.properties</w:t>
       </w:r>
       <w:proofErr w:type="spellEnd"/>
-      <w:proofErr w:type="gramEnd"/>
       <w:r>
         <w:rPr>
           <w:sz w:val="24"/>
@@ -6468,6 +6077,20 @@
           <w:szCs w:val="24"/>
         </w:rPr>
         <w:t>:</w:t>
+      </w:r>
+      <w:r>
+        <w:rPr>
+          <w:sz w:val="24"/>
+          <w:szCs w:val="24"/>
+        </w:rPr>
+        <w:t xml:space="preserve"> </w:t>
+      </w:r>
+      <w:r>
+        <w:rPr>
+          <w:sz w:val="24"/>
+          <w:szCs w:val="24"/>
+        </w:rPr>
+        <w:t>https://github.com/plattat/sistema-educativo-microservicios-nombre/tree/master</w:t>
       </w:r>
     </w:p>
     <w:p>

</xml_diff>